<commit_message>
Fix h1/<title> tag confusion across Week 3 materials and the vocabulary bank
Several Week 3 Lesson 1-2 materials incorrectly described <h1> as "the page
title." <title> (in <head>) sets the browser tab text; <h1> is the biggest
visible heading on the page. They are different tags. Corrected the Heading
vocabulary definition (data/week03.js, Frayer Models, Word Wall, both Student
Study Guide versions) and the specific lesson/worksheet lines that repeated
the error (W3L1 planning sheet, W3L2 checkpoint sheets). Added an explicit
clarifying note in W3L1's teacher demo steps and exit ticket so the
distinction is taught directly, not just avoided.
</commit_message>
<xml_diff>
--- a/resources/student-study-guide/Design 1 - Student Study Guide (Visual Notebook Style).docx
+++ b/resources/student-study-guide/Design 1 - Student Study Guide (Visual Notebook Style).docx
@@ -2196,7 +2196,7 @@
           <w:sz w:val="22"/>
           <w:szCs w:val="22"/>
         </w:rPr>
-        <w:t xml:space="preserve">With his skeleton ready, Zayd started on his homepage. He used one h1 for his site title and h2s for each new section, careful never to skip a level just because a smaller heading looked better in the moment.</w:t>
+        <w:t xml:space="preserve">With his skeleton ready, Zayd started on his homepage. He used one h1 for his main heading and h2s for each new section, careful never to skip a level just because a smaller heading looked better in the moment.</w:t>
       </w:r>
     </w:p>
     <w:p>
@@ -2416,7 +2416,7 @@
           <w:sz w:val="19"/>
           <w:szCs w:val="19"/>
         </w:rPr>
-        <w:t xml:space="preserve">A title tag (h1 through h6) that labels a page or section. h1 is most important, h6 least.</w:t>
+        <w:t xml:space="preserve">A heading tag (h1 through h6) that labels a page or section. h1 is most important, h6 least. Not the same as the title tag.</w:t>
       </w:r>
     </w:p>
     <w:p>
@@ -8154,7 +8154,7 @@
           <w:sz w:val="19"/>
           <w:szCs w:val="19"/>
         </w:rPr>
-        <w:t xml:space="preserve">A title tag (h1 through h6) that labels a page or section.</w:t>
+        <w:t xml:space="preserve">A heading tag (h1 through h6) that labels a page or section. Not the same as the title tag.</w:t>
       </w:r>
     </w:p>
     <w:p>

</xml_diff>

<commit_message>
Restore original Student Study Guide design; add v2 with minimal text fix
The previous h1/<title> fix added a full explanatory sentence to the
"Heading" vocabulary entry, which overflowed its fixed-size box in the
Visual Notebook Style layout. Reverted both study guide files to their
original, unedited state.

Added new "v2" files instead of editing in place: same design, same
layout, only the confusing word swapped ("title tag" -> "heading tag",
"site title" -> "main heading"), matching length closely enough that
the layout is untouched (verified: same 18 pages, only 2-4 characters
different per page).
</commit_message>
<xml_diff>
--- a/resources/student-study-guide/Design 1 - Student Study Guide (Visual Notebook Style).docx
+++ b/resources/student-study-guide/Design 1 - Student Study Guide (Visual Notebook Style).docx
@@ -2196,7 +2196,7 @@
           <w:sz w:val="22"/>
           <w:szCs w:val="22"/>
         </w:rPr>
-        <w:t xml:space="preserve">With his skeleton ready, Zayd started on his homepage. He used one h1 for his main heading and h2s for each new section, careful never to skip a level just because a smaller heading looked better in the moment.</w:t>
+        <w:t xml:space="preserve">With his skeleton ready, Zayd started on his homepage. He used one h1 for his site title and h2s for each new section, careful never to skip a level just because a smaller heading looked better in the moment.</w:t>
       </w:r>
     </w:p>
     <w:p>
@@ -2416,7 +2416,7 @@
           <w:sz w:val="19"/>
           <w:szCs w:val="19"/>
         </w:rPr>
-        <w:t xml:space="preserve">A heading tag (h1 through h6) that labels a page or section. h1 is most important, h6 least. Not the same as the title tag.</w:t>
+        <w:t xml:space="preserve">A title tag (h1 through h6) that labels a page or section. h1 is most important, h6 least.</w:t>
       </w:r>
     </w:p>
     <w:p>
@@ -8154,7 +8154,7 @@
           <w:sz w:val="19"/>
           <w:szCs w:val="19"/>
         </w:rPr>
-        <w:t xml:space="preserve">A heading tag (h1 through h6) that labels a page or section. Not the same as the title tag.</w:t>
+        <w:t xml:space="preserve">A title tag (h1 through h6) that labels a page or section.</w:t>
       </w:r>
     </w:p>
     <w:p>

</xml_diff>

<commit_message>
Promote v2 study guide files to the live filenames
</commit_message>
<xml_diff>
--- a/resources/student-study-guide/Design 1 - Student Study Guide (Visual Notebook Style).docx
+++ b/resources/student-study-guide/Design 1 - Student Study Guide (Visual Notebook Style).docx
@@ -2196,7 +2196,7 @@
           <w:sz w:val="22"/>
           <w:szCs w:val="22"/>
         </w:rPr>
-        <w:t xml:space="preserve">With his skeleton ready, Zayd started on his homepage. He used one h1 for his site title and h2s for each new section, careful never to skip a level just because a smaller heading looked better in the moment.</w:t>
+        <w:t xml:space="preserve">With his skeleton ready, Zayd started on his homepage. He used one h1 for his main heading and h2s for each new section, careful never to skip a level just because a smaller heading looked better in the moment.</w:t>
       </w:r>
     </w:p>
     <w:p>
@@ -2416,7 +2416,7 @@
           <w:sz w:val="19"/>
           <w:szCs w:val="19"/>
         </w:rPr>
-        <w:t xml:space="preserve">A title tag (h1 through h6) that labels a page or section. h1 is most important, h6 least.</w:t>
+        <w:t xml:space="preserve">A heading tag (h1 through h6) that labels a page or section. h1 is most important, h6 least.</w:t>
       </w:r>
     </w:p>
     <w:p>
@@ -8154,7 +8154,7 @@
           <w:sz w:val="19"/>
           <w:szCs w:val="19"/>
         </w:rPr>
-        <w:t xml:space="preserve">A title tag (h1 through h6) that labels a page or section.</w:t>
+        <w:t xml:space="preserve">A heading tag (h1 through h6) that labels a page or section.</w:t>
       </w:r>
     </w:p>
     <w:p>

</xml_diff>